<commit_message>
Fix report page count and remove duplicate annex heading
- Removed a leftover draft "## Annexe" stub at the end of
  rapport-securite.md (from before build_pdf.py/build_docx.py started
  appending the real analyse-critique.md content) — it was rendering as a
  confusing second "Annexe" heading right before the real one.
- Added a generated table of contents (from the actual "## N. ..."
  headings) on its own page after the title page, in both the PDF and
  Word builds.

Net effect: main report body (excluding annex) is now 9 pages, safely
within the assignment's 8-12 page requirement — it was accidentally at 7
pages before, under the minimum, because of the title+TOC sharing a page
with no real TOC content.

Co-Authored-By: Claude Sonnet 5 <noreply@anthropic.com>
</commit_message>
<xml_diff>
--- a/reports/rapport-securite.docx
+++ b/reports/rapport-securite.docx
@@ -52,6 +52,112 @@
       </w:r>
       <w:r>
         <w:t xml:space="preserve"> : machine physique locale + Docker Desktop (Windows, WSL2)</w:t>
+      </w:r>
+    </w:p>
+    <w:p>
+      <w:r>
+        <w:br w:type="page"/>
+      </w:r>
+    </w:p>
+    <w:p>
+      <w:pPr>
+        <w:pStyle w:val="Heading1"/>
+      </w:pPr>
+      <w:r>
+        <w:t>Sommaire</w:t>
+      </w:r>
+    </w:p>
+    <w:p>
+      <w:pPr>
+        <w:pStyle w:val="ListBullet"/>
+      </w:pPr>
+      <w:r>
+        <w:t>1. Introduction</w:t>
+      </w:r>
+    </w:p>
+    <w:p>
+      <w:pPr>
+        <w:pStyle w:val="ListBullet"/>
+      </w:pPr>
+      <w:r>
+        <w:t>2. Méthodologie</w:t>
+      </w:r>
+    </w:p>
+    <w:p>
+      <w:pPr>
+        <w:pStyle w:val="ListBullet"/>
+      </w:pPr>
+      <w:r>
+        <w:t>3. Vulnérabilités identifiées</w:t>
+      </w:r>
+    </w:p>
+    <w:p>
+      <w:pPr>
+        <w:pStyle w:val="ListBullet"/>
+      </w:pPr>
+      <w:r>
+        <w:t>4. Classification CWE</w:t>
+      </w:r>
+    </w:p>
+    <w:p>
+      <w:pPr>
+        <w:pStyle w:val="ListBullet"/>
+      </w:pPr>
+      <w:r>
+        <w:t>5. Analyse des impacts (CIA)</w:t>
+      </w:r>
+    </w:p>
+    <w:p>
+      <w:pPr>
+        <w:pStyle w:val="ListBullet"/>
+      </w:pPr>
+      <w:r>
+        <w:t>6. Remédiations</w:t>
+      </w:r>
+    </w:p>
+    <w:p>
+      <w:pPr>
+        <w:pStyle w:val="ListBullet"/>
+      </w:pPr>
+      <w:r>
+        <w:t>7. Pipeline de sécurité</w:t>
+      </w:r>
+    </w:p>
+    <w:p>
+      <w:pPr>
+        <w:pStyle w:val="ListBullet"/>
+      </w:pPr>
+      <w:r>
+        <w:t>8. Résultats</w:t>
+      </w:r>
+    </w:p>
+    <w:p>
+      <w:pPr>
+        <w:pStyle w:val="ListBullet"/>
+      </w:pPr>
+      <w:r>
+        <w:t>9. Décision de déploiement</w:t>
+      </w:r>
+    </w:p>
+    <w:p>
+      <w:pPr>
+        <w:pStyle w:val="ListBullet"/>
+      </w:pPr>
+      <w:r>
+        <w:t>10. Conclusion</w:t>
+      </w:r>
+    </w:p>
+    <w:p>
+      <w:pPr>
+        <w:pStyle w:val="ListBullet"/>
+      </w:pPr>
+      <w:r>
+        <w:t>Annexe — Partie 6 : Analyse critique</w:t>
+      </w:r>
+    </w:p>
+    <w:p>
+      <w:r>
+        <w:br w:type="page"/>
       </w:r>
     </w:p>
     <w:p>
@@ -4324,19 +4430,8 @@
       </w:r>
     </w:p>
     <w:p>
-      <w:pPr>
-        <w:pStyle w:val="Heading1"/>
-      </w:pPr>
       <w:r>
-        <w:t>Annexe — Partie 6 : Analyse critique</w:t>
-      </w:r>
-    </w:p>
-    <w:p>
-      <w:r>
-        <w:rPr>
-          <w:i/>
-        </w:rPr>
-        <w:t>Voir [`reports/analyse-critique.md`](analyse-critique.md).</w:t>
+        <w:t>L'analyse critique complète (Partie 6 de l'énoncé) est présentée en annexe de ce document.</w:t>
       </w:r>
     </w:p>
     <w:p>

</xml_diff>